<commit_message>
Update Group Contributions Form.docx
</commit_message>
<xml_diff>
--- a/Final Submission/Group Contributions Form.docx
+++ b/Final Submission/Group Contributions Form.docx
@@ -143,10 +143,7 @@
           </w:tcPr>
           <w:p>
             <w:r>
-              <w:t>Created the working prototypes for the 'Stacker' and 'Worm' mini-games.</w:t>
-            </w:r>
-            <w:r>
-              <w:t xml:space="preserve"> Also the initial prototype of the functioning website, and contributions after Aarju took the lead developer role.</w:t>
+              <w:t>Created the working prototypes for the 'Stacker' and 'Worm' mini-games. Also the initial prototype of the functioning website, and contributions after Aarju took the lead developer role.</w:t>
             </w:r>
           </w:p>
           <w:p/>
@@ -158,10 +155,7 @@
           <w:p/>
           <w:p>
             <w:r>
-              <w:t>Helped m</w:t>
-            </w:r>
-            <w:r>
-              <w:t>anage the Git/GitHub repository and fixed upload issues so our code didn't break.</w:t>
+              <w:t>Helped manage the Git/GitHub repository and fixed upload issues so our code didn't break.</w:t>
             </w:r>
           </w:p>
           <w:p/>
@@ -396,13 +390,85 @@
           <w:tcPr>
             <w:tcW w:w="3499" w:type="dxa"/>
           </w:tcPr>
-          <w:p/>
+          <w:p>
+            <w:r>
+              <w:t>capture the flag prototype</w:t>
+            </w:r>
+          </w:p>
+          <w:p>
+            <w:r>
+              <w:t>Stacker Minigame</w:t>
+            </w:r>
+          </w:p>
+          <w:p>
+            <w:r>
+              <w:t>Game Assets</w:t>
+            </w:r>
+          </w:p>
+          <w:p>
+            <w:r>
+              <w:t>Accessibility Features</w:t>
+            </w:r>
+          </w:p>
+          <w:p>
+            <w:r>
+              <w:t xml:space="preserve">Visual and Audio assets </w:t>
+            </w:r>
+          </w:p>
+          <w:p>
+            <w:r>
+              <w:t xml:space="preserve">Sound Effects </w:t>
+            </w:r>
+          </w:p>
+          <w:p>
+            <w:r>
+              <w:t xml:space="preserve">Found space for </w:t>
+            </w:r>
+            <w:r>
+              <w:t xml:space="preserve">the project to be ported onto </w:t>
+            </w:r>
+          </w:p>
+          <w:p>
+            <w:r>
+              <w:t>User Acceptance Testing plan</w:t>
+            </w:r>
+          </w:p>
         </w:tc>
         <w:tc>
           <w:tcPr>
             <w:tcW w:w="2738" w:type="dxa"/>
           </w:tcPr>
-          <w:p/>
+          <w:p>
+            <w:r>
+              <w:t xml:space="preserve">I want to thank the group for </w:t>
+            </w:r>
+            <w:r>
+              <w:t>a great academic year and a project to show for</w:t>
+            </w:r>
+            <w:r>
+              <w:t xml:space="preserve"> it</w:t>
+            </w:r>
+            <w:r>
+              <w:t xml:space="preserve">. </w:t>
+            </w:r>
+          </w:p>
+          <w:p/>
+          <w:p>
+            <w:proofErr w:type="spellStart"/>
+            <w:r>
+              <w:t>Arjuu</w:t>
+            </w:r>
+            <w:proofErr w:type="spellEnd"/>
+            <w:r>
+              <w:t xml:space="preserve"> did a great job across the project, </w:t>
+            </w:r>
+            <w:r>
+              <w:t>especially with the frontend and firebase setup. Marc also di an excellent join integrating AI and creating the minigames</w:t>
+            </w:r>
+            <w:r>
+              <w:t>.</w:t>
+            </w:r>
+          </w:p>
         </w:tc>
         <w:tc>
           <w:tcPr>
@@ -652,14 +718,52 @@
           </w:tcPr>
           <w:p/>
           <w:p/>
-          <w:p/>
+          <w:p>
+            <w:r>
+              <w:drawing>
+                <wp:inline distT="0" distB="0" distL="0" distR="0" wp14:anchorId="25968C0E" wp14:editId="03E1F650">
+                  <wp:extent cx="1881963" cy="764782"/>
+                  <wp:effectExtent l="0" t="0" r="4445" b="0"/>
+                  <wp:docPr id="290038280" name="Picture 1"/>
+                  <wp:cNvGraphicFramePr>
+                    <a:graphicFrameLocks xmlns:a="http://schemas.openxmlformats.org/drawingml/2006/main" noChangeAspect="1"/>
+                  </wp:cNvGraphicFramePr>
+                  <a:graphic xmlns:a="http://schemas.openxmlformats.org/drawingml/2006/main">
+                    <a:graphicData uri="http://schemas.openxmlformats.org/drawingml/2006/picture">
+                      <pic:pic xmlns:pic="http://schemas.openxmlformats.org/drawingml/2006/picture">
+                        <pic:nvPicPr>
+                          <pic:cNvPr id="290038280" name=""/>
+                          <pic:cNvPicPr/>
+                        </pic:nvPicPr>
+                        <pic:blipFill>
+                          <a:blip r:embed="rId8"/>
+                          <a:stretch>
+                            <a:fillRect/>
+                          </a:stretch>
+                        </pic:blipFill>
+                        <pic:spPr>
+                          <a:xfrm>
+                            <a:off x="0" y="0"/>
+                            <a:ext cx="1894736" cy="769973"/>
+                          </a:xfrm>
+                          <a:prstGeom prst="rect">
+                            <a:avLst/>
+                          </a:prstGeom>
+                        </pic:spPr>
+                      </pic:pic>
+                    </a:graphicData>
+                  </a:graphic>
+                </wp:inline>
+              </w:drawing>
+            </w:r>
+          </w:p>
           <w:p/>
         </w:tc>
       </w:tr>
     </w:tbl>
     <w:p/>
     <w:sectPr>
-      <w:footerReference w:type="default" r:id="rId8"/>
+      <w:footerReference w:type="default" r:id="rId9"/>
       <w:pgSz w:w="11906" w:h="16838"/>
       <w:pgMar w:top="1440" w:right="1440" w:bottom="1440" w:left="1440" w:header="708" w:footer="708" w:gutter="0"/>
       <w:cols w:space="708"/>
@@ -1170,6 +1274,7 @@
   <w:style w:type="character" w:default="1" w:styleId="DefaultParagraphFont">
     <w:name w:val="Default Paragraph Font"/>
     <w:uiPriority w:val="1"/>
+    <w:semiHidden/>
     <w:unhideWhenUsed/>
   </w:style>
   <w:style w:type="table" w:default="1" w:styleId="TableNormal">

</xml_diff>